<commit_message>
all that i have done since the beginning of 6th semester, i have not published smth for some time, oops)
</commit_message>
<xml_diff>
--- a/6th semester/Вычислительные сети и контроль безопасности в компьютерных сетях/2/ВСКБКС_ЛР2_БардышевАА_СуханкулиевМ_ШангинаЕК.docx
+++ b/6th semester/Вычислительные сети и контроль безопасности в компьютерных сетях/2/ВСКБКС_ЛР2_БардышевАА_СуханкулиевМ_ШангинаЕК.docx
@@ -260,6 +260,73 @@
         <w:jc w:val="right"/>
       </w:pPr>
       <w:r>
+        <w:rPr>
+          <w:noProof/>
+        </w:rPr>
+        <w:drawing>
+          <wp:anchor distT="0" distB="0" distL="114300" distR="114300" simplePos="0" relativeHeight="251659264" behindDoc="0" locked="0" layoutInCell="1" allowOverlap="1" wp14:anchorId="7D576327" wp14:editId="065536BB">
+            <wp:simplePos x="0" y="0"/>
+            <wp:positionH relativeFrom="column">
+              <wp:posOffset>4847590</wp:posOffset>
+            </wp:positionH>
+            <wp:positionV relativeFrom="paragraph">
+              <wp:posOffset>473075</wp:posOffset>
+            </wp:positionV>
+            <wp:extent cx="911505" cy="288000"/>
+            <wp:effectExtent l="0" t="0" r="3175" b="0"/>
+            <wp:wrapNone/>
+            <wp:docPr id="302023653" name="Рисунок 1" descr="Изображение выглядит как игла&#10;&#10;Содержимое, созданное искусственным интеллектом, может быть неверным."/>
+            <wp:cNvGraphicFramePr>
+              <a:graphicFrameLocks xmlns:a="http://schemas.openxmlformats.org/drawingml/2006/main" noChangeAspect="1"/>
+            </wp:cNvGraphicFramePr>
+            <a:graphic xmlns:a="http://schemas.openxmlformats.org/drawingml/2006/main">
+              <a:graphicData uri="http://schemas.openxmlformats.org/drawingml/2006/picture">
+                <pic:pic xmlns:pic="http://schemas.openxmlformats.org/drawingml/2006/picture">
+                  <pic:nvPicPr>
+                    <pic:cNvPr id="302023653" name="Рисунок 1" descr="Изображение выглядит как игла&#10;&#10;Содержимое, созданное искусственным интеллектом, может быть неверным."/>
+                    <pic:cNvPicPr>
+                      <a:picLocks noChangeAspect="1" noChangeArrowheads="1"/>
+                    </pic:cNvPicPr>
+                  </pic:nvPicPr>
+                  <pic:blipFill>
+                    <a:blip r:embed="rId8" cstate="print">
+                      <a:extLst>
+                        <a:ext uri="{28A0092B-C50C-407E-A947-70E740481C1C}">
+                          <a14:useLocalDpi xmlns:a14="http://schemas.microsoft.com/office/drawing/2010/main" val="0"/>
+                        </a:ext>
+                      </a:extLst>
+                    </a:blip>
+                    <a:srcRect/>
+                    <a:stretch>
+                      <a:fillRect/>
+                    </a:stretch>
+                  </pic:blipFill>
+                  <pic:spPr bwMode="auto">
+                    <a:xfrm>
+                      <a:off x="0" y="0"/>
+                      <a:ext cx="911505" cy="288000"/>
+                    </a:xfrm>
+                    <a:prstGeom prst="rect">
+                      <a:avLst/>
+                    </a:prstGeom>
+                    <a:noFill/>
+                    <a:ln>
+                      <a:noFill/>
+                    </a:ln>
+                  </pic:spPr>
+                </pic:pic>
+              </a:graphicData>
+            </a:graphic>
+            <wp14:sizeRelH relativeFrom="page">
+              <wp14:pctWidth>0</wp14:pctWidth>
+            </wp14:sizeRelH>
+            <wp14:sizeRelV relativeFrom="page">
+              <wp14:pctHeight>0</wp14:pctHeight>
+            </wp14:sizeRelV>
+          </wp:anchor>
+        </w:drawing>
+      </w:r>
+      <w:r>
         <w:t>Бардышев Артём Антонович,</w:t>
       </w:r>
       <w:r>
@@ -313,6 +380,74 @@
         <w:jc w:val="right"/>
       </w:pPr>
       <w:r>
+        <w:rPr>
+          <w:b/>
+          <w:noProof/>
+        </w:rPr>
+        <w:drawing>
+          <wp:anchor distT="0" distB="0" distL="114300" distR="114300" simplePos="0" relativeHeight="251661312" behindDoc="0" locked="0" layoutInCell="1" allowOverlap="1" wp14:anchorId="06CE6BD0" wp14:editId="1B4EF0D9">
+            <wp:simplePos x="0" y="0"/>
+            <wp:positionH relativeFrom="column">
+              <wp:posOffset>4731615</wp:posOffset>
+            </wp:positionH>
+            <wp:positionV relativeFrom="paragraph">
+              <wp:posOffset>487782</wp:posOffset>
+            </wp:positionV>
+            <wp:extent cx="847725" cy="287655"/>
+            <wp:effectExtent l="0" t="0" r="9525" b="0"/>
+            <wp:wrapNone/>
+            <wp:docPr id="142271362" name="Рисунок 1" descr="Изображение выглядит как линия, свет&#10;&#10;Содержимое, созданное искусственным интеллектом, может быть неверным."/>
+            <wp:cNvGraphicFramePr>
+              <a:graphicFrameLocks xmlns:a="http://schemas.openxmlformats.org/drawingml/2006/main" noChangeAspect="1"/>
+            </wp:cNvGraphicFramePr>
+            <a:graphic xmlns:a="http://schemas.openxmlformats.org/drawingml/2006/main">
+              <a:graphicData uri="http://schemas.openxmlformats.org/drawingml/2006/picture">
+                <pic:pic xmlns:pic="http://schemas.openxmlformats.org/drawingml/2006/picture">
+                  <pic:nvPicPr>
+                    <pic:cNvPr id="142271362" name="Рисунок 1" descr="Изображение выглядит как линия, свет&#10;&#10;Содержимое, созданное искусственным интеллектом, может быть неверным."/>
+                    <pic:cNvPicPr>
+                      <a:picLocks noChangeAspect="1" noChangeArrowheads="1"/>
+                    </pic:cNvPicPr>
+                  </pic:nvPicPr>
+                  <pic:blipFill>
+                    <a:blip r:embed="rId9" cstate="print">
+                      <a:extLst>
+                        <a:ext uri="{28A0092B-C50C-407E-A947-70E740481C1C}">
+                          <a14:useLocalDpi xmlns:a14="http://schemas.microsoft.com/office/drawing/2010/main" val="0"/>
+                        </a:ext>
+                      </a:extLst>
+                    </a:blip>
+                    <a:srcRect/>
+                    <a:stretch>
+                      <a:fillRect/>
+                    </a:stretch>
+                  </pic:blipFill>
+                  <pic:spPr bwMode="auto">
+                    <a:xfrm>
+                      <a:off x="0" y="0"/>
+                      <a:ext cx="847725" cy="287655"/>
+                    </a:xfrm>
+                    <a:prstGeom prst="rect">
+                      <a:avLst/>
+                    </a:prstGeom>
+                    <a:noFill/>
+                    <a:ln>
+                      <a:noFill/>
+                    </a:ln>
+                  </pic:spPr>
+                </pic:pic>
+              </a:graphicData>
+            </a:graphic>
+            <wp14:sizeRelH relativeFrom="page">
+              <wp14:pctWidth>0</wp14:pctWidth>
+            </wp14:sizeRelH>
+            <wp14:sizeRelV relativeFrom="page">
+              <wp14:pctHeight>0</wp14:pctHeight>
+            </wp14:sizeRelV>
+          </wp:anchor>
+        </w:drawing>
+      </w:r>
+      <w:r>
         <w:t>Суханкулиев Мухаммет,</w:t>
       </w:r>
       <w:r>
@@ -366,6 +501,73 @@
         <w:jc w:val="right"/>
       </w:pPr>
       <w:r>
+        <w:rPr>
+          <w:noProof/>
+        </w:rPr>
+        <w:drawing>
+          <wp:anchor distT="0" distB="0" distL="114300" distR="114300" simplePos="0" relativeHeight="251662336" behindDoc="0" locked="0" layoutInCell="1" allowOverlap="1" wp14:anchorId="300ADBB2" wp14:editId="3EDA08AB">
+            <wp:simplePos x="0" y="0"/>
+            <wp:positionH relativeFrom="column">
+              <wp:posOffset>4990506</wp:posOffset>
+            </wp:positionH>
+            <wp:positionV relativeFrom="paragraph">
+              <wp:posOffset>426341</wp:posOffset>
+            </wp:positionV>
+            <wp:extent cx="372854" cy="432000"/>
+            <wp:effectExtent l="0" t="0" r="8255" b="6350"/>
+            <wp:wrapNone/>
+            <wp:docPr id="291827304" name="Рисунок 1" descr="Изображение выглядит как рисунок, зарисовка, Детское искусство&#10;&#10;Содержимое, созданное искусственным интеллектом, может быть неверным."/>
+            <wp:cNvGraphicFramePr>
+              <a:graphicFrameLocks xmlns:a="http://schemas.openxmlformats.org/drawingml/2006/main" noChangeAspect="1"/>
+            </wp:cNvGraphicFramePr>
+            <a:graphic xmlns:a="http://schemas.openxmlformats.org/drawingml/2006/main">
+              <a:graphicData uri="http://schemas.openxmlformats.org/drawingml/2006/picture">
+                <pic:pic xmlns:pic="http://schemas.openxmlformats.org/drawingml/2006/picture">
+                  <pic:nvPicPr>
+                    <pic:cNvPr id="291827304" name="Рисунок 1" descr="Изображение выглядит как рисунок, зарисовка, Детское искусство&#10;&#10;Содержимое, созданное искусственным интеллектом, может быть неверным."/>
+                    <pic:cNvPicPr>
+                      <a:picLocks noChangeAspect="1" noChangeArrowheads="1"/>
+                    </pic:cNvPicPr>
+                  </pic:nvPicPr>
+                  <pic:blipFill>
+                    <a:blip r:embed="rId10" cstate="print">
+                      <a:extLst>
+                        <a:ext uri="{28A0092B-C50C-407E-A947-70E740481C1C}">
+                          <a14:useLocalDpi xmlns:a14="http://schemas.microsoft.com/office/drawing/2010/main" val="0"/>
+                        </a:ext>
+                      </a:extLst>
+                    </a:blip>
+                    <a:srcRect/>
+                    <a:stretch>
+                      <a:fillRect/>
+                    </a:stretch>
+                  </pic:blipFill>
+                  <pic:spPr bwMode="auto">
+                    <a:xfrm>
+                      <a:off x="0" y="0"/>
+                      <a:ext cx="372854" cy="432000"/>
+                    </a:xfrm>
+                    <a:prstGeom prst="rect">
+                      <a:avLst/>
+                    </a:prstGeom>
+                    <a:noFill/>
+                    <a:ln>
+                      <a:noFill/>
+                    </a:ln>
+                  </pic:spPr>
+                </pic:pic>
+              </a:graphicData>
+            </a:graphic>
+            <wp14:sizeRelH relativeFrom="page">
+              <wp14:pctWidth>0</wp14:pctWidth>
+            </wp14:sizeRelH>
+            <wp14:sizeRelV relativeFrom="page">
+              <wp14:pctHeight>0</wp14:pctHeight>
+            </wp14:sizeRelV>
+          </wp:anchor>
+        </w:drawing>
+      </w:r>
+      <w:r>
         <w:t>Шангина Елизавета Кирилловна,</w:t>
       </w:r>
       <w:r>
@@ -512,8 +714,8 @@
     <w:p>
       <w:pPr>
         <w:sectPr>
-          <w:headerReference w:type="default" r:id="rId8"/>
-          <w:footerReference w:type="default" r:id="rId9"/>
+          <w:headerReference w:type="default" r:id="rId11"/>
+          <w:footerReference w:type="default" r:id="rId12"/>
           <w:pgSz w:w="11906" w:h="16838"/>
           <w:pgMar w:top="1134" w:right="850" w:bottom="1134" w:left="1701" w:header="708" w:footer="708" w:gutter="0"/>
           <w:pgNumType w:start="2"/>
@@ -2882,10 +3084,7 @@
         <w:t xml:space="preserve">Цель работы – </w:t>
       </w:r>
       <w:r>
-        <w:t xml:space="preserve">получить </w:t>
-      </w:r>
-      <w:r>
-        <w:t>представление об основных угрозах сетевой безопасности на канальном уровне. Изучить базовые инструменты безопасности, используемые на коммутаторах.</w:t>
+        <w:t>получить представление об основных угрозах сетевой безопасности на канальном уровне. Изучить базовые инструменты безопасности, используемые на коммутаторах.</w:t>
       </w:r>
     </w:p>
     <w:p>
@@ -3030,10 +3229,7 @@
         <w:ind w:left="0" w:firstLine="709"/>
       </w:pPr>
       <w:r>
-        <w:t xml:space="preserve">настроить </w:t>
-      </w:r>
-      <w:r>
-        <w:t xml:space="preserve">Port </w:t>
+        <w:t xml:space="preserve">настроить Port </w:t>
       </w:r>
       <w:proofErr w:type="spellStart"/>
       <w:r>
@@ -3057,10 +3253,7 @@
         <w:ind w:left="0" w:firstLine="709"/>
       </w:pPr>
       <w:r>
-        <w:t xml:space="preserve">настроить </w:t>
-      </w:r>
-      <w:r>
-        <w:t xml:space="preserve">DHCP </w:t>
+        <w:t xml:space="preserve">настроить DHCP </w:t>
       </w:r>
       <w:proofErr w:type="spellStart"/>
       <w:r>
@@ -3230,7 +3423,7 @@
                     </pic:cNvPicPr>
                   </pic:nvPicPr>
                   <pic:blipFill>
-                    <a:blip r:embed="rId10">
+                    <a:blip r:embed="rId13">
                       <a:extLst>
                         <a:ext uri="{28A0092B-C50C-407E-A947-70E740481C1C}">
                           <a14:useLocalDpi xmlns:a14="http://schemas.microsoft.com/office/drawing/2010/main" val="0"/>
@@ -3311,7 +3504,7 @@
                     <pic:cNvPicPr/>
                   </pic:nvPicPr>
                   <pic:blipFill>
-                    <a:blip r:embed="rId11"/>
+                    <a:blip r:embed="rId14"/>
                     <a:stretch>
                       <a:fillRect/>
                     </a:stretch>
@@ -3588,23 +3781,7 @@
           <w:rFonts w:eastAsia="Courier New"/>
           <w:lang w:val="en-US"/>
         </w:rPr>
-        <w:t xml:space="preserve"> </w:t>
-      </w:r>
-      <w:proofErr w:type="gramStart"/>
-      <w:r>
-        <w:rPr>
-          <w:rFonts w:eastAsia="Courier New"/>
-          <w:lang w:val="en-US"/>
-        </w:rPr>
-        <w:t>no</w:t>
-      </w:r>
-      <w:proofErr w:type="gramEnd"/>
-      <w:r>
-        <w:rPr>
-          <w:rFonts w:eastAsia="Courier New"/>
-          <w:lang w:val="en-US"/>
-        </w:rPr>
-        <w:t xml:space="preserve"> shutdown</w:t>
+        <w:t xml:space="preserve"> no shutdown</w:t>
       </w:r>
     </w:p>
     <w:p>
@@ -3636,7 +3813,6 @@
           <w:rFonts w:eastAsia="Courier New"/>
         </w:rPr>
       </w:pPr>
-      <w:proofErr w:type="gramStart"/>
       <w:r>
         <w:rPr>
           <w:rFonts w:eastAsia="Courier New"/>
@@ -3644,7 +3820,6 @@
         </w:rPr>
         <w:t>write</w:t>
       </w:r>
-      <w:proofErr w:type="gramEnd"/>
     </w:p>
     <w:p>
       <w:pPr>
@@ -3998,23 +4173,7 @@
           <w:rFonts w:eastAsia="Courier New"/>
           <w:lang w:val="en-US"/>
         </w:rPr>
-        <w:t xml:space="preserve"> </w:t>
-      </w:r>
-      <w:proofErr w:type="gramStart"/>
-      <w:r>
-        <w:rPr>
-          <w:rFonts w:eastAsia="Courier New"/>
-          <w:lang w:val="en-US"/>
-        </w:rPr>
-        <w:t>no</w:t>
-      </w:r>
-      <w:proofErr w:type="gramEnd"/>
-      <w:r>
-        <w:rPr>
-          <w:rFonts w:eastAsia="Courier New"/>
-          <w:lang w:val="en-US"/>
-        </w:rPr>
-        <w:t xml:space="preserve"> shutdown</w:t>
+        <w:t xml:space="preserve"> no shutdown</w:t>
       </w:r>
     </w:p>
     <w:p>
@@ -4106,23 +4265,7 @@
           <w:rFonts w:eastAsia="Courier New"/>
           <w:lang w:val="en-US"/>
         </w:rPr>
-        <w:t xml:space="preserve"> </w:t>
-      </w:r>
-      <w:proofErr w:type="gramStart"/>
-      <w:r>
-        <w:rPr>
-          <w:rFonts w:eastAsia="Courier New"/>
-          <w:lang w:val="en-US"/>
-        </w:rPr>
-        <w:t>no</w:t>
-      </w:r>
-      <w:proofErr w:type="gramEnd"/>
-      <w:r>
-        <w:rPr>
-          <w:rFonts w:eastAsia="Courier New"/>
-          <w:lang w:val="en-US"/>
-        </w:rPr>
-        <w:t xml:space="preserve"> shutdown</w:t>
+        <w:t xml:space="preserve"> no shutdown</w:t>
       </w:r>
     </w:p>
     <w:p>
@@ -4214,23 +4357,7 @@
           <w:rFonts w:eastAsia="Courier New"/>
           <w:lang w:val="en-US"/>
         </w:rPr>
-        <w:t xml:space="preserve"> </w:t>
-      </w:r>
-      <w:proofErr w:type="gramStart"/>
-      <w:r>
-        <w:rPr>
-          <w:rFonts w:eastAsia="Courier New"/>
-          <w:lang w:val="en-US"/>
-        </w:rPr>
-        <w:t>no</w:t>
-      </w:r>
-      <w:proofErr w:type="gramEnd"/>
-      <w:r>
-        <w:rPr>
-          <w:rFonts w:eastAsia="Courier New"/>
-          <w:lang w:val="en-US"/>
-        </w:rPr>
-        <w:t xml:space="preserve"> shutdown</w:t>
+        <w:t xml:space="preserve"> no shutdown</w:t>
       </w:r>
     </w:p>
     <w:p>
@@ -4262,7 +4389,6 @@
           <w:rFonts w:eastAsia="Courier New"/>
         </w:rPr>
       </w:pPr>
-      <w:proofErr w:type="gramStart"/>
       <w:r>
         <w:rPr>
           <w:rFonts w:eastAsia="Courier New"/>
@@ -4270,7 +4396,6 @@
         </w:rPr>
         <w:t>write</w:t>
       </w:r>
-      <w:proofErr w:type="gramEnd"/>
     </w:p>
     <w:p>
       <w:pPr>
@@ -4426,6 +4551,11 @@
       </w:r>
     </w:p>
     <w:p>
+      <w:pPr>
+        <w:rPr>
+          <w:lang w:val="en-US"/>
+        </w:rPr>
+      </w:pPr>
       <w:proofErr w:type="spellStart"/>
       <w:r>
         <w:lastRenderedPageBreak/>
@@ -4433,6 +4563,9 @@
       </w:r>
       <w:proofErr w:type="spellEnd"/>
       <w:r>
+        <w:rPr>
+          <w:lang w:val="en-US"/>
+        </w:rPr>
         <w:t xml:space="preserve"> - Trunk</w:t>
       </w:r>
     </w:p>
@@ -4509,28 +4642,41 @@
           <w:rFonts w:eastAsia="Courier New"/>
           <w:lang w:val="en-US"/>
         </w:rPr>
+        <w:t xml:space="preserve"> no shutdown</w:t>
+      </w:r>
+    </w:p>
+    <w:p>
+      <w:pPr>
+        <w:rPr>
+          <w:lang w:val="en-US"/>
+        </w:rPr>
+      </w:pPr>
+      <w:r>
+        <w:t>Порты</w:t>
+      </w:r>
+      <w:r>
+        <w:rPr>
+          <w:lang w:val="en-US"/>
+        </w:rPr>
         <w:t xml:space="preserve"> </w:t>
       </w:r>
-      <w:proofErr w:type="gramStart"/>
-      <w:r>
-        <w:rPr>
-          <w:rFonts w:eastAsia="Courier New"/>
-          <w:lang w:val="en-US"/>
-        </w:rPr>
-        <w:t>no</w:t>
-      </w:r>
-      <w:proofErr w:type="gramEnd"/>
-      <w:r>
-        <w:rPr>
-          <w:rFonts w:eastAsia="Courier New"/>
-          <w:lang w:val="en-US"/>
-        </w:rPr>
-        <w:t xml:space="preserve"> shutdown</w:t>
-      </w:r>
-    </w:p>
-    <w:p>
-      <w:r>
-        <w:t>Порты к ПК - Access</w:t>
+      <w:r>
+        <w:t>к</w:t>
+      </w:r>
+      <w:r>
+        <w:rPr>
+          <w:lang w:val="en-US"/>
+        </w:rPr>
+        <w:t xml:space="preserve"> </w:t>
+      </w:r>
+      <w:r>
+        <w:t>ПК</w:t>
+      </w:r>
+      <w:r>
+        <w:rPr>
+          <w:lang w:val="en-US"/>
+        </w:rPr>
+        <w:t xml:space="preserve"> - Access</w:t>
       </w:r>
     </w:p>
     <w:p>
@@ -4622,23 +4768,7 @@
           <w:rFonts w:eastAsia="Courier New"/>
           <w:lang w:val="en-US"/>
         </w:rPr>
-        <w:t xml:space="preserve"> </w:t>
-      </w:r>
-      <w:proofErr w:type="gramStart"/>
-      <w:r>
-        <w:rPr>
-          <w:rFonts w:eastAsia="Courier New"/>
-          <w:lang w:val="en-US"/>
-        </w:rPr>
-        <w:t>no</w:t>
-      </w:r>
-      <w:proofErr w:type="gramEnd"/>
-      <w:r>
-        <w:rPr>
-          <w:rFonts w:eastAsia="Courier New"/>
-          <w:lang w:val="en-US"/>
-        </w:rPr>
-        <w:t xml:space="preserve"> shutdown</w:t>
+        <w:t xml:space="preserve"> no shutdown</w:t>
       </w:r>
     </w:p>
     <w:p>
@@ -4730,23 +4860,7 @@
           <w:rFonts w:eastAsia="Courier New"/>
           <w:lang w:val="en-US"/>
         </w:rPr>
-        <w:t xml:space="preserve"> </w:t>
-      </w:r>
-      <w:proofErr w:type="gramStart"/>
-      <w:r>
-        <w:rPr>
-          <w:rFonts w:eastAsia="Courier New"/>
-          <w:lang w:val="en-US"/>
-        </w:rPr>
-        <w:t>no</w:t>
-      </w:r>
-      <w:proofErr w:type="gramEnd"/>
-      <w:r>
-        <w:rPr>
-          <w:rFonts w:eastAsia="Courier New"/>
-          <w:lang w:val="en-US"/>
-        </w:rPr>
-        <w:t xml:space="preserve"> shutdown</w:t>
+        <w:t xml:space="preserve"> no shutdown</w:t>
       </w:r>
     </w:p>
     <w:p>
@@ -4823,7 +4937,7 @@
                     <pic:cNvPicPr/>
                   </pic:nvPicPr>
                   <pic:blipFill>
-                    <a:blip r:embed="rId12"/>
+                    <a:blip r:embed="rId15"/>
                     <a:stretch>
                       <a:fillRect/>
                     </a:stretch>
@@ -4946,7 +5060,7 @@
                     <pic:cNvPicPr/>
                   </pic:nvPicPr>
                   <pic:blipFill>
-                    <a:blip r:embed="rId13"/>
+                    <a:blip r:embed="rId16"/>
                     <a:stretch>
                       <a:fillRect/>
                     </a:stretch>
@@ -5058,7 +5172,7 @@
                     <pic:cNvPicPr/>
                   </pic:nvPicPr>
                   <pic:blipFill>
-                    <a:blip r:embed="rId14"/>
+                    <a:blip r:embed="rId17"/>
                     <a:stretch>
                       <a:fillRect/>
                     </a:stretch>
@@ -5387,7 +5501,6 @@
         </w:rPr>
         <w:t xml:space="preserve"> </w:t>
       </w:r>
-      <w:proofErr w:type="gramStart"/>
       <w:r>
         <w:rPr>
           <w:rFonts w:eastAsia="Courier New"/>
@@ -5395,7 +5508,6 @@
         </w:rPr>
         <w:t>no</w:t>
       </w:r>
-      <w:proofErr w:type="gramEnd"/>
       <w:r>
         <w:rPr>
           <w:rFonts w:eastAsia="Courier New"/>
@@ -5702,7 +5814,6 @@
         <w:t xml:space="preserve"> </w:t>
       </w:r>
       <w:proofErr w:type="spellStart"/>
-      <w:proofErr w:type="gramStart"/>
       <w:r>
         <w:rPr>
           <w:rFonts w:eastAsia="Courier New"/>
@@ -5711,7 +5822,6 @@
         <w:t>ip</w:t>
       </w:r>
       <w:proofErr w:type="spellEnd"/>
-      <w:proofErr w:type="gramEnd"/>
       <w:r>
         <w:rPr>
           <w:rFonts w:eastAsia="Courier New"/>
@@ -5816,23 +5926,7 @@
           <w:rFonts w:eastAsia="Courier New"/>
           <w:lang w:val="en-US"/>
         </w:rPr>
-        <w:t xml:space="preserve"> </w:t>
-      </w:r>
-      <w:proofErr w:type="gramStart"/>
-      <w:r>
-        <w:rPr>
-          <w:rFonts w:eastAsia="Courier New"/>
-          <w:lang w:val="en-US"/>
-        </w:rPr>
-        <w:t>excluded-address</w:t>
-      </w:r>
-      <w:proofErr w:type="gramEnd"/>
-      <w:r>
-        <w:rPr>
-          <w:rFonts w:eastAsia="Courier New"/>
-          <w:lang w:val="en-US"/>
-        </w:rPr>
-        <w:t xml:space="preserve"> 192.168.10.1 192.168.10.9</w:t>
+        <w:t xml:space="preserve"> excluded-address 192.168.10.1 192.168.10.9</w:t>
       </w:r>
     </w:p>
     <w:p>
@@ -5876,23 +5970,7 @@
           <w:rFonts w:eastAsia="Courier New"/>
           <w:lang w:val="en-US"/>
         </w:rPr>
-        <w:t xml:space="preserve"> </w:t>
-      </w:r>
-      <w:proofErr w:type="gramStart"/>
-      <w:r>
-        <w:rPr>
-          <w:rFonts w:eastAsia="Courier New"/>
-          <w:lang w:val="en-US"/>
-        </w:rPr>
-        <w:t>excluded-address</w:t>
-      </w:r>
-      <w:proofErr w:type="gramEnd"/>
-      <w:r>
-        <w:rPr>
-          <w:rFonts w:eastAsia="Courier New"/>
-          <w:lang w:val="en-US"/>
-        </w:rPr>
-        <w:t xml:space="preserve"> 192.168.10.101 192.168.10.254</w:t>
+        <w:t xml:space="preserve"> excluded-address 192.168.10.101 192.168.10.254</w:t>
       </w:r>
     </w:p>
     <w:p>
@@ -5948,23 +6026,7 @@
           <w:rFonts w:eastAsia="Courier New"/>
           <w:lang w:val="en-US"/>
         </w:rPr>
-        <w:t xml:space="preserve"> </w:t>
-      </w:r>
-      <w:proofErr w:type="gramStart"/>
-      <w:r>
-        <w:rPr>
-          <w:rFonts w:eastAsia="Courier New"/>
-          <w:lang w:val="en-US"/>
-        </w:rPr>
-        <w:t>excluded-address</w:t>
-      </w:r>
-      <w:proofErr w:type="gramEnd"/>
-      <w:r>
-        <w:rPr>
-          <w:rFonts w:eastAsia="Courier New"/>
-          <w:lang w:val="en-US"/>
-        </w:rPr>
-        <w:t xml:space="preserve"> 192.168.15.1 192.168.15.9</w:t>
+        <w:t xml:space="preserve"> excluded-address 192.168.15.1 192.168.15.9</w:t>
       </w:r>
     </w:p>
     <w:p>
@@ -6008,23 +6070,7 @@
           <w:rFonts w:eastAsia="Courier New"/>
           <w:lang w:val="en-US"/>
         </w:rPr>
-        <w:t xml:space="preserve"> </w:t>
-      </w:r>
-      <w:proofErr w:type="gramStart"/>
-      <w:r>
-        <w:rPr>
-          <w:rFonts w:eastAsia="Courier New"/>
-          <w:lang w:val="en-US"/>
-        </w:rPr>
-        <w:t>excluded-address</w:t>
-      </w:r>
-      <w:proofErr w:type="gramEnd"/>
-      <w:r>
-        <w:rPr>
-          <w:rFonts w:eastAsia="Courier New"/>
-          <w:lang w:val="en-US"/>
-        </w:rPr>
-        <w:t xml:space="preserve"> 192.168.15.101 192.168.15.254</w:t>
+        <w:t xml:space="preserve"> excluded-address 192.168.15.101 192.168.15.254</w:t>
       </w:r>
     </w:p>
     <w:p>
@@ -6081,23 +6127,7 @@
           <w:rFonts w:eastAsia="Courier New"/>
           <w:lang w:val="en-US"/>
         </w:rPr>
-        <w:t xml:space="preserve"> </w:t>
-      </w:r>
-      <w:proofErr w:type="gramStart"/>
-      <w:r>
-        <w:rPr>
-          <w:rFonts w:eastAsia="Courier New"/>
-          <w:lang w:val="en-US"/>
-        </w:rPr>
-        <w:t>excluded-address</w:t>
-      </w:r>
-      <w:proofErr w:type="gramEnd"/>
-      <w:r>
-        <w:rPr>
-          <w:rFonts w:eastAsia="Courier New"/>
-          <w:lang w:val="en-US"/>
-        </w:rPr>
-        <w:t xml:space="preserve"> 192.168.20.1 192.168.20.9</w:t>
+        <w:t xml:space="preserve"> excluded-address 192.168.20.1 192.168.20.9</w:t>
       </w:r>
     </w:p>
     <w:p>
@@ -6141,23 +6171,7 @@
           <w:rFonts w:eastAsia="Courier New"/>
           <w:lang w:val="en-US"/>
         </w:rPr>
-        <w:t xml:space="preserve"> </w:t>
-      </w:r>
-      <w:proofErr w:type="gramStart"/>
-      <w:r>
-        <w:rPr>
-          <w:rFonts w:eastAsia="Courier New"/>
-          <w:lang w:val="en-US"/>
-        </w:rPr>
-        <w:t>excluded-address</w:t>
-      </w:r>
-      <w:proofErr w:type="gramEnd"/>
-      <w:r>
-        <w:rPr>
-          <w:rFonts w:eastAsia="Courier New"/>
-          <w:lang w:val="en-US"/>
-        </w:rPr>
-        <w:t xml:space="preserve"> 192.168.20.101 192.168.20.254</w:t>
+        <w:t xml:space="preserve"> excluded-address 192.168.20.101 192.168.20.254</w:t>
       </w:r>
     </w:p>
     <w:p>
@@ -6173,18 +6187,10 @@
       </w:pPr>
     </w:p>
     <w:p>
-      <w:pPr>
-        <w:rPr>
-          <w:lang w:val="en-US"/>
-        </w:rPr>
-      </w:pPr>
       <w:r>
         <w:t>Создаем пулы</w:t>
       </w:r>
       <w:r>
-        <w:rPr>
-          <w:lang w:val="en-US"/>
-        </w:rPr>
         <w:t>:</w:t>
       </w:r>
     </w:p>
@@ -6196,7 +6202,6 @@
         <w:ind w:left="709" w:hanging="709"/>
         <w:rPr>
           <w:rFonts w:eastAsia="Courier New"/>
-          <w:lang w:val="en-US"/>
         </w:rPr>
       </w:pPr>
       <w:proofErr w:type="spellStart"/>
@@ -6211,7 +6216,6 @@
       <w:r>
         <w:rPr>
           <w:rFonts w:eastAsia="Courier New"/>
-          <w:lang w:val="en-US"/>
         </w:rPr>
         <w:t xml:space="preserve"> </w:t>
       </w:r>
@@ -6227,9 +6231,34 @@
       <w:r>
         <w:rPr>
           <w:rFonts w:eastAsia="Courier New"/>
-          <w:lang w:val="en-US"/>
-        </w:rPr>
-        <w:t xml:space="preserve"> pool V10</w:t>
+        </w:rPr>
+        <w:t xml:space="preserve"> </w:t>
+      </w:r>
+      <w:r>
+        <w:rPr>
+          <w:rFonts w:eastAsia="Courier New"/>
+          <w:lang w:val="en-US"/>
+        </w:rPr>
+        <w:t>pool</w:t>
+      </w:r>
+      <w:r>
+        <w:rPr>
+          <w:rFonts w:eastAsia="Courier New"/>
+        </w:rPr>
+        <w:t xml:space="preserve"> </w:t>
+      </w:r>
+      <w:r>
+        <w:rPr>
+          <w:rFonts w:eastAsia="Courier New"/>
+          <w:lang w:val="en-US"/>
+        </w:rPr>
+        <w:t>V</w:t>
+      </w:r>
+      <w:r>
+        <w:rPr>
+          <w:rFonts w:eastAsia="Courier New"/>
+        </w:rPr>
+        <w:t>10</w:t>
       </w:r>
     </w:p>
     <w:p>
@@ -6246,9 +6275,15 @@
       <w:r>
         <w:rPr>
           <w:rFonts w:eastAsia="Courier New"/>
-          <w:lang w:val="en-US"/>
-        </w:rPr>
-        <w:t xml:space="preserve"> network 192.168.10.0 255.255.255.0</w:t>
+        </w:rPr>
+        <w:t xml:space="preserve"> </w:t>
+      </w:r>
+      <w:r>
+        <w:rPr>
+          <w:rFonts w:eastAsia="Courier New"/>
+          <w:lang w:val="en-US"/>
+        </w:rPr>
+        <w:t>network 192.168.10.0 255.255.255.0</w:t>
       </w:r>
     </w:p>
     <w:p>
@@ -6521,21 +6556,12 @@
           <w:lang w:val="en-US"/>
         </w:rPr>
       </w:pPr>
-      <w:proofErr w:type="gramStart"/>
-      <w:r>
-        <w:rPr>
-          <w:rFonts w:eastAsia="Courier New"/>
-          <w:lang w:val="en-US"/>
-        </w:rPr>
-        <w:t>write</w:t>
-      </w:r>
-      <w:proofErr w:type="gramEnd"/>
-      <w:r>
-        <w:rPr>
-          <w:rFonts w:eastAsia="Courier New"/>
-          <w:lang w:val="en-US"/>
-        </w:rPr>
-        <w:t xml:space="preserve"> </w:t>
+      <w:r>
+        <w:rPr>
+          <w:rFonts w:eastAsia="Courier New"/>
+          <w:lang w:val="en-US"/>
+        </w:rPr>
+        <w:t xml:space="preserve">write </w:t>
       </w:r>
     </w:p>
     <w:p>
@@ -6571,7 +6597,7 @@
                     <pic:cNvPicPr/>
                   </pic:nvPicPr>
                   <pic:blipFill>
-                    <a:blip r:embed="rId15"/>
+                    <a:blip r:embed="rId18"/>
                     <a:stretch>
                       <a:fillRect/>
                     </a:stretch>
@@ -6845,16 +6871,8 @@
         <w:rPr>
           <w:lang w:eastAsia="en-US"/>
         </w:rPr>
-        <w:t xml:space="preserve"> 10 с адресом шлюза 192.168.10.254/</w:t>
-      </w:r>
-      <w:proofErr w:type="gramStart"/>
-      <w:r>
-        <w:rPr>
-          <w:lang w:eastAsia="en-US"/>
-        </w:rPr>
-        <w:t>24;</w:t>
-      </w:r>
-      <w:proofErr w:type="gramEnd"/>
+        <w:t xml:space="preserve"> 10 с адресом шлюза 192.168.10.254/24;</w:t>
+      </w:r>
     </w:p>
     <w:p>
       <w:pPr>
@@ -6902,16 +6920,8 @@
         <w:rPr>
           <w:lang w:eastAsia="en-US"/>
         </w:rPr>
-        <w:t xml:space="preserve"> 15 с адресом шлюза 192.168.15.254/</w:t>
-      </w:r>
-      <w:proofErr w:type="gramStart"/>
-      <w:r>
-        <w:rPr>
-          <w:lang w:eastAsia="en-US"/>
-        </w:rPr>
-        <w:t>24;</w:t>
-      </w:r>
-      <w:proofErr w:type="gramEnd"/>
+        <w:t xml:space="preserve"> 15 с адресом шлюза 192.168.15.254/24;</w:t>
+      </w:r>
     </w:p>
     <w:p>
       <w:pPr>
@@ -7090,7 +7100,7 @@
                     <pic:cNvPicPr/>
                   </pic:nvPicPr>
                   <pic:blipFill>
-                    <a:blip r:embed="rId16"/>
+                    <a:blip r:embed="rId19"/>
                     <a:stretch>
                       <a:fillRect/>
                     </a:stretch>
@@ -7195,7 +7205,7 @@
                     <pic:cNvPicPr/>
                   </pic:nvPicPr>
                   <pic:blipFill>
-                    <a:blip r:embed="rId17"/>
+                    <a:blip r:embed="rId20"/>
                     <a:stretch>
                       <a:fillRect/>
                     </a:stretch>
@@ -7375,13 +7385,7 @@
     </w:p>
     <w:p>
       <w:r>
-        <w:t xml:space="preserve">Уязвимость: </w:t>
-      </w:r>
-      <w:r>
-        <w:t xml:space="preserve">размер </w:t>
-      </w:r>
-      <w:r>
-        <w:t xml:space="preserve">таблицы CAM ограничен (обычно 8000–16000 записей в зависимости от модели). Атакующий может воспользоваться этим ограничением, запустив программу типа </w:t>
+        <w:t xml:space="preserve">Уязвимость: размер таблицы CAM ограничен (обычно 8000–16000 записей в зависимости от модели). Атакующий может воспользоваться этим ограничением, запустив программу типа </w:t>
       </w:r>
       <w:proofErr w:type="spellStart"/>
       <w:r>
@@ -7402,13 +7406,7 @@
     </w:p>
     <w:p>
       <w:r>
-        <w:t>Решение</w:t>
-      </w:r>
-      <w:r>
-        <w:t>: ограничить</w:t>
-      </w:r>
-      <w:r>
-        <w:t xml:space="preserve"> количество MAC-адресов на порту до 1 и </w:t>
+        <w:t xml:space="preserve">Решение: ограничить количество MAC-адресов на порту до 1 и </w:t>
       </w:r>
       <w:r>
         <w:t>«</w:t>
@@ -7957,23 +7955,7 @@
           <w:rFonts w:eastAsia="Courier New"/>
           <w:lang w:val="en-US"/>
         </w:rPr>
-        <w:t xml:space="preserve"> </w:t>
-      </w:r>
-      <w:proofErr w:type="gramStart"/>
-      <w:r>
-        <w:rPr>
-          <w:rFonts w:eastAsia="Courier New"/>
-          <w:lang w:val="en-US"/>
-        </w:rPr>
-        <w:t>switchport</w:t>
-      </w:r>
-      <w:proofErr w:type="gramEnd"/>
-      <w:r>
-        <w:rPr>
-          <w:rFonts w:eastAsia="Courier New"/>
-          <w:lang w:val="en-US"/>
-        </w:rPr>
-        <w:t xml:space="preserve"> port-security violation shutdown</w:t>
+        <w:t xml:space="preserve"> switchport port-security violation shutdown</w:t>
       </w:r>
     </w:p>
     <w:p>
@@ -8218,7 +8200,7 @@
                     <pic:cNvPicPr/>
                   </pic:nvPicPr>
                   <pic:blipFill>
-                    <a:blip r:embed="rId18"/>
+                    <a:blip r:embed="rId21"/>
                     <a:stretch>
                       <a:fillRect/>
                     </a:stretch>
@@ -8422,7 +8404,7 @@
                     <pic:cNvPicPr/>
                   </pic:nvPicPr>
                   <pic:blipFill>
-                    <a:blip r:embed="rId19"/>
+                    <a:blip r:embed="rId22"/>
                     <a:stretch>
                       <a:fillRect/>
                     </a:stretch>
@@ -8622,7 +8604,7 @@
                     <pic:cNvPicPr/>
                   </pic:nvPicPr>
                   <pic:blipFill>
-                    <a:blip r:embed="rId20"/>
+                    <a:blip r:embed="rId23"/>
                     <a:stretch>
                       <a:fillRect/>
                     </a:stretch>
@@ -8770,7 +8752,7 @@
                     <pic:cNvPicPr/>
                   </pic:nvPicPr>
                   <pic:blipFill>
-                    <a:blip r:embed="rId21"/>
+                    <a:blip r:embed="rId24"/>
                     <a:stretch>
                       <a:fillRect/>
                     </a:stretch>
@@ -8939,7 +8921,7 @@
                     <pic:cNvPicPr/>
                   </pic:nvPicPr>
                   <pic:blipFill>
-                    <a:blip r:embed="rId22"/>
+                    <a:blip r:embed="rId25"/>
                     <a:stretch>
                       <a:fillRect/>
                     </a:stretch>
@@ -9249,6 +9231,7 @@
         <w:ind w:left="709" w:hanging="709"/>
         <w:rPr>
           <w:rFonts w:eastAsia="Courier New"/>
+          <w:lang w:val="en-US"/>
         </w:rPr>
       </w:pPr>
       <w:r>
@@ -9261,6 +9244,7 @@
       <w:r>
         <w:rPr>
           <w:rFonts w:eastAsia="Courier New"/>
+          <w:lang w:val="en-US"/>
         </w:rPr>
         <w:t xml:space="preserve"> </w:t>
       </w:r>
@@ -9506,7 +9490,13 @@
         <w:rPr>
           <w:lang w:eastAsia="en-US"/>
         </w:rPr>
-        <w:t>2. Настройка Доверенных портов (</w:t>
+        <w:t xml:space="preserve">Доверенными портами </w:t>
+      </w:r>
+      <w:r>
+        <w:rPr>
+          <w:lang w:eastAsia="en-US"/>
+        </w:rPr>
+        <w:t>(</w:t>
       </w:r>
       <w:proofErr w:type="spellStart"/>
       <w:r>
@@ -9534,20 +9524,13 @@
         <w:rPr>
           <w:lang w:eastAsia="en-US"/>
         </w:rPr>
-        <w:t>)</w:t>
-      </w:r>
-    </w:p>
-    <w:p>
-      <w:pPr>
-        <w:rPr>
-          <w:lang w:eastAsia="en-US"/>
-        </w:rPr>
-      </w:pPr>
-      <w:r>
-        <w:rPr>
-          <w:lang w:eastAsia="en-US"/>
-        </w:rPr>
-        <w:t>Доверенными портами назначаются интерфейсы, смотрящие в сторону реального роутера R1 (источника IP-адресов):</w:t>
+        <w:t xml:space="preserve">) </w:t>
+      </w:r>
+      <w:r>
+        <w:rPr>
+          <w:lang w:eastAsia="en-US"/>
+        </w:rPr>
+        <w:t>назначаются интерфейсы, смотрящие в сторону реального роутера R1 (источника IP-адресов):</w:t>
       </w:r>
     </w:p>
     <w:p>
@@ -9617,7 +9600,6 @@
           <w:rFonts w:eastAsia="Courier New"/>
           <w:lang w:val="en-US"/>
         </w:rPr>
-        <w:lastRenderedPageBreak/>
         <w:t xml:space="preserve"> </w:t>
       </w:r>
       <w:proofErr w:type="spellStart"/>
@@ -9668,6 +9650,7 @@
           <w:rFonts w:eastAsia="Courier New"/>
           <w:lang w:val="en-US"/>
         </w:rPr>
+        <w:lastRenderedPageBreak/>
         <w:t>exit</w:t>
       </w:r>
     </w:p>
@@ -10179,26 +10162,78 @@
     <w:p>
       <w:pPr>
         <w:rPr>
-          <w:lang w:eastAsia="en-US"/>
-        </w:rPr>
-      </w:pPr>
-      <w:r>
-        <w:rPr>
-          <w:lang w:eastAsia="en-US"/>
-        </w:rPr>
-        <w:t xml:space="preserve">Конфигурация фальшивого сервера на роутере </w:t>
-      </w:r>
-      <w:proofErr w:type="spellStart"/>
-      <w:r>
-        <w:rPr>
-          <w:lang w:eastAsia="en-US"/>
+          <w:lang w:val="en-US" w:eastAsia="en-US"/>
+        </w:rPr>
+      </w:pPr>
+      <w:r>
+        <w:rPr>
+          <w:lang w:eastAsia="en-US"/>
+        </w:rPr>
+        <w:t>Конфигурация</w:t>
+      </w:r>
+      <w:r>
+        <w:rPr>
+          <w:lang w:val="en-US" w:eastAsia="en-US"/>
+        </w:rPr>
+        <w:t xml:space="preserve"> </w:t>
+      </w:r>
+      <w:r>
+        <w:rPr>
+          <w:lang w:eastAsia="en-US"/>
+        </w:rPr>
+        <w:t>фальшивого</w:t>
+      </w:r>
+      <w:r>
+        <w:rPr>
+          <w:lang w:val="en-US" w:eastAsia="en-US"/>
+        </w:rPr>
+        <w:t xml:space="preserve"> </w:t>
+      </w:r>
+      <w:r>
+        <w:rPr>
+          <w:lang w:eastAsia="en-US"/>
+        </w:rPr>
+        <w:t>сервера</w:t>
+      </w:r>
+      <w:r>
+        <w:rPr>
+          <w:lang w:val="en-US" w:eastAsia="en-US"/>
+        </w:rPr>
+        <w:t xml:space="preserve"> </w:t>
+      </w:r>
+      <w:r>
+        <w:rPr>
+          <w:lang w:eastAsia="en-US"/>
+        </w:rPr>
+        <w:t>на</w:t>
+      </w:r>
+      <w:r>
+        <w:rPr>
+          <w:lang w:val="en-US" w:eastAsia="en-US"/>
+        </w:rPr>
+        <w:t xml:space="preserve"> </w:t>
+      </w:r>
+      <w:r>
+        <w:rPr>
+          <w:lang w:eastAsia="en-US"/>
+        </w:rPr>
+        <w:t>роутере</w:t>
+      </w:r>
+      <w:r>
+        <w:rPr>
+          <w:lang w:val="en-US" w:eastAsia="en-US"/>
+        </w:rPr>
+        <w:t xml:space="preserve"> </w:t>
+      </w:r>
+      <w:r>
+        <w:rPr>
+          <w:lang w:val="en-US" w:eastAsia="en-US"/>
         </w:rPr>
         <w:t>Rouge</w:t>
       </w:r>
-      <w:proofErr w:type="spellEnd"/>
-      <w:r>
-        <w:rPr>
-          <w:lang w:eastAsia="en-US"/>
+      <w:r>
+        <w:rPr>
+          <w:lang w:val="en-US" w:eastAsia="en-US"/>
         </w:rPr>
         <w:t>:</w:t>
       </w:r>
@@ -10292,23 +10327,7 @@
           <w:rFonts w:eastAsia="Courier New"/>
           <w:lang w:val="en-US"/>
         </w:rPr>
-        <w:t xml:space="preserve"> </w:t>
-      </w:r>
-      <w:proofErr w:type="gramStart"/>
-      <w:r>
-        <w:rPr>
-          <w:rFonts w:eastAsia="Courier New"/>
-          <w:lang w:val="en-US"/>
-        </w:rPr>
-        <w:t>no</w:t>
-      </w:r>
-      <w:proofErr w:type="gramEnd"/>
-      <w:r>
-        <w:rPr>
-          <w:rFonts w:eastAsia="Courier New"/>
-          <w:lang w:val="en-US"/>
-        </w:rPr>
-        <w:t xml:space="preserve"> shut</w:t>
+        <w:t xml:space="preserve"> no shut</w:t>
       </w:r>
     </w:p>
     <w:p>
@@ -10595,62 +10614,62 @@
         <w:rPr>
           <w:lang w:eastAsia="en-US"/>
         </w:rPr>
+        <w:t xml:space="preserve">Теперь на </w:t>
+      </w:r>
+      <w:r>
+        <w:rPr>
+          <w:lang w:val="en-US" w:eastAsia="en-US"/>
+        </w:rPr>
+        <w:t>PC</w:t>
+      </w:r>
+      <w:r>
+        <w:rPr>
+          <w:lang w:eastAsia="en-US"/>
+        </w:rPr>
+        <w:t xml:space="preserve">1 запросим адрес: </w:t>
+      </w:r>
+      <w:proofErr w:type="spellStart"/>
+      <w:r>
+        <w:rPr>
+          <w:rFonts w:ascii="Courier New" w:eastAsia="Courier New" w:hAnsi="Courier New"/>
+          <w:lang w:val="en-US"/>
+        </w:rPr>
+        <w:t>ip</w:t>
+      </w:r>
+      <w:proofErr w:type="spellEnd"/>
+      <w:r>
+        <w:rPr>
+          <w:rFonts w:ascii="Courier New" w:eastAsia="Courier New" w:hAnsi="Courier New"/>
+        </w:rPr>
+        <w:t xml:space="preserve"> </w:t>
+      </w:r>
+      <w:proofErr w:type="spellStart"/>
+      <w:r>
+        <w:rPr>
+          <w:rFonts w:ascii="Courier New" w:eastAsia="Courier New" w:hAnsi="Courier New"/>
+          <w:lang w:val="en-US"/>
+        </w:rPr>
+        <w:t>dhcp</w:t>
+      </w:r>
+      <w:proofErr w:type="spellEnd"/>
+      <w:r>
+        <w:rPr>
+          <w:rFonts w:ascii="Courier New" w:eastAsia="Courier New" w:hAnsi="Courier New"/>
+        </w:rPr>
+        <w:t>.</w:t>
+      </w:r>
+    </w:p>
+    <w:p>
+      <w:pPr>
+        <w:rPr>
+          <w:lang w:eastAsia="en-US"/>
+        </w:rPr>
+      </w:pPr>
+      <w:r>
+        <w:rPr>
+          <w:lang w:eastAsia="en-US"/>
+        </w:rPr>
         <w:lastRenderedPageBreak/>
-        <w:t xml:space="preserve">Теперь на </w:t>
-      </w:r>
-      <w:r>
-        <w:rPr>
-          <w:lang w:val="en-US" w:eastAsia="en-US"/>
-        </w:rPr>
-        <w:t>PC</w:t>
-      </w:r>
-      <w:r>
-        <w:rPr>
-          <w:lang w:eastAsia="en-US"/>
-        </w:rPr>
-        <w:t xml:space="preserve">1 запросим адрес: </w:t>
-      </w:r>
-      <w:proofErr w:type="spellStart"/>
-      <w:r>
-        <w:rPr>
-          <w:rFonts w:ascii="Courier New" w:eastAsia="Courier New" w:hAnsi="Courier New"/>
-          <w:lang w:val="en-US"/>
-        </w:rPr>
-        <w:t>ip</w:t>
-      </w:r>
-      <w:proofErr w:type="spellEnd"/>
-      <w:r>
-        <w:rPr>
-          <w:rFonts w:ascii="Courier New" w:eastAsia="Courier New" w:hAnsi="Courier New"/>
-        </w:rPr>
-        <w:t xml:space="preserve"> </w:t>
-      </w:r>
-      <w:proofErr w:type="spellStart"/>
-      <w:r>
-        <w:rPr>
-          <w:rFonts w:ascii="Courier New" w:eastAsia="Courier New" w:hAnsi="Courier New"/>
-          <w:lang w:val="en-US"/>
-        </w:rPr>
-        <w:t>dhcp</w:t>
-      </w:r>
-      <w:proofErr w:type="spellEnd"/>
-      <w:r>
-        <w:rPr>
-          <w:rFonts w:ascii="Courier New" w:eastAsia="Courier New" w:hAnsi="Courier New"/>
-        </w:rPr>
-        <w:t>.</w:t>
-      </w:r>
-    </w:p>
-    <w:p>
-      <w:pPr>
-        <w:rPr>
-          <w:lang w:eastAsia="en-US"/>
-        </w:rPr>
-      </w:pPr>
-      <w:r>
-        <w:rPr>
-          <w:lang w:eastAsia="en-US"/>
-        </w:rPr>
         <w:t xml:space="preserve">Результат: </w:t>
       </w:r>
       <w:r>
@@ -10735,7 +10754,7 @@
                     <pic:cNvPicPr/>
                   </pic:nvPicPr>
                   <pic:blipFill>
-                    <a:blip r:embed="rId23"/>
+                    <a:blip r:embed="rId26"/>
                     <a:stretch>
                       <a:fillRect/>
                     </a:stretch>
@@ -10937,7 +10956,7 @@
                     <pic:cNvPicPr/>
                   </pic:nvPicPr>
                   <pic:blipFill>
-                    <a:blip r:embed="rId24"/>
+                    <a:blip r:embed="rId27"/>
                     <a:stretch>
                       <a:fillRect/>
                     </a:stretch>
@@ -11114,13 +11133,27 @@
         <w:rPr>
           <w:lang w:eastAsia="en-US"/>
         </w:rPr>
-        <w:t xml:space="preserve"> проверяет каждый ARP-пакет. Если связка IP и MAC в пакете не совпадает с данными в «белой базе» (Snooping </w:t>
+        <w:t xml:space="preserve"> проверяет каждый ARP-пакет. Если связка IP и MAC в пакете не совпадает с данными в «белой базе» (</w:t>
       </w:r>
       <w:proofErr w:type="spellStart"/>
       <w:r>
         <w:rPr>
           <w:lang w:eastAsia="en-US"/>
         </w:rPr>
+        <w:t>Snooping</w:t>
+      </w:r>
+      <w:proofErr w:type="spellEnd"/>
+      <w:r>
+        <w:rPr>
+          <w:lang w:eastAsia="en-US"/>
+        </w:rPr>
+        <w:t xml:space="preserve"> </w:t>
+      </w:r>
+      <w:proofErr w:type="spellStart"/>
+      <w:r>
+        <w:rPr>
+          <w:lang w:eastAsia="en-US"/>
+        </w:rPr>
         <w:t>Binding</w:t>
       </w:r>
       <w:proofErr w:type="spellEnd"/>
@@ -11145,19 +11178,6 @@
       <w:pPr>
         <w:rPr>
           <w:lang w:eastAsia="en-US"/>
-        </w:rPr>
-      </w:pPr>
-      <w:r>
-        <w:rPr>
-          <w:lang w:eastAsia="en-US"/>
-        </w:rPr>
-        <w:t>Шаг 1. Восстановление (Recovery)</w:t>
-      </w:r>
-    </w:p>
-    <w:p>
-      <w:pPr>
-        <w:rPr>
-          <w:lang w:val="en-US" w:eastAsia="en-US"/>
         </w:rPr>
       </w:pPr>
       <w:r>
@@ -11188,6 +11208,7 @@
         <w:ind w:left="709" w:hanging="709"/>
         <w:rPr>
           <w:rFonts w:eastAsia="Courier New"/>
+          <w:lang w:val="en-US"/>
         </w:rPr>
       </w:pPr>
       <w:r>
@@ -11200,6 +11221,7 @@
       <w:r>
         <w:rPr>
           <w:rFonts w:eastAsia="Courier New"/>
+          <w:lang w:val="en-US"/>
         </w:rPr>
         <w:t xml:space="preserve"> </w:t>
       </w:r>
@@ -11219,6 +11241,7 @@
         <w:ind w:left="709" w:hanging="709"/>
         <w:rPr>
           <w:rFonts w:eastAsia="Courier New"/>
+          <w:lang w:val="en-US"/>
         </w:rPr>
       </w:pPr>
       <w:r>
@@ -11231,6 +11254,7 @@
       <w:r>
         <w:rPr>
           <w:rFonts w:eastAsia="Courier New"/>
+          <w:lang w:val="en-US"/>
         </w:rPr>
         <w:t xml:space="preserve"> </w:t>
       </w:r>
@@ -11244,6 +11268,7 @@
       <w:r>
         <w:rPr>
           <w:rFonts w:eastAsia="Courier New"/>
+          <w:lang w:val="en-US"/>
         </w:rPr>
         <w:t>0/0</w:t>
       </w:r>
@@ -11256,15 +11281,16 @@
         <w:ind w:left="709" w:hanging="709"/>
         <w:rPr>
           <w:rFonts w:eastAsia="Courier New"/>
-        </w:rPr>
-      </w:pPr>
-      <w:r>
-        <w:rPr>
-          <w:rFonts w:eastAsia="Courier New"/>
+          <w:lang w:val="en-US"/>
+        </w:rPr>
+      </w:pPr>
+      <w:r>
+        <w:rPr>
+          <w:rFonts w:eastAsia="Courier New"/>
+          <w:lang w:val="en-US"/>
         </w:rPr>
         <w:t xml:space="preserve"> </w:t>
       </w:r>
-      <w:proofErr w:type="gramStart"/>
       <w:r>
         <w:rPr>
           <w:rFonts w:eastAsia="Courier New"/>
@@ -11272,10 +11298,10 @@
         </w:rPr>
         <w:t>no</w:t>
       </w:r>
-      <w:proofErr w:type="gramEnd"/>
-      <w:r>
-        <w:rPr>
-          <w:rFonts w:eastAsia="Courier New"/>
+      <w:r>
+        <w:rPr>
+          <w:rFonts w:eastAsia="Courier New"/>
+          <w:lang w:val="en-US"/>
         </w:rPr>
         <w:t xml:space="preserve"> </w:t>
       </w:r>
@@ -11295,13 +11321,14 @@
         <w:ind w:left="709" w:hanging="709"/>
         <w:rPr>
           <w:rFonts w:eastAsia="Courier New"/>
-        </w:rPr>
-      </w:pPr>
-    </w:p>
-    <w:p>
-      <w:pPr>
-        <w:rPr>
-          <w:lang w:val="en-US" w:eastAsia="en-US"/>
+          <w:lang w:val="en-US"/>
+        </w:rPr>
+      </w:pPr>
+    </w:p>
+    <w:p>
+      <w:pPr>
+        <w:rPr>
+          <w:lang w:eastAsia="en-US"/>
         </w:rPr>
       </w:pPr>
       <w:r>
@@ -11487,7 +11514,7 @@
                     <pic:cNvPicPr/>
                   </pic:nvPicPr>
                   <pic:blipFill>
-                    <a:blip r:embed="rId25"/>
+                    <a:blip r:embed="rId28"/>
                     <a:stretch>
                       <a:fillRect/>
                     </a:stretch>
@@ -11871,7 +11898,6 @@
           <w:rFonts w:eastAsia="Courier New"/>
         </w:rPr>
       </w:pPr>
-      <w:proofErr w:type="gramStart"/>
       <w:r>
         <w:rPr>
           <w:rFonts w:eastAsia="Courier New"/>
@@ -11879,7 +11905,6 @@
         </w:rPr>
         <w:t>write</w:t>
       </w:r>
-      <w:proofErr w:type="gramEnd"/>
     </w:p>
     <w:p>
       <w:pPr>
@@ -11971,7 +11996,6 @@
         <w:ind w:left="709" w:hanging="709"/>
         <w:rPr>
           <w:rFonts w:eastAsia="Courier New"/>
-          <w:lang w:val="en-US"/>
         </w:rPr>
       </w:pPr>
       <w:proofErr w:type="spellStart"/>
@@ -11986,7 +12010,6 @@
       <w:r>
         <w:rPr>
           <w:rFonts w:eastAsia="Courier New"/>
-          <w:lang w:val="en-US"/>
         </w:rPr>
         <w:t xml:space="preserve"> 192.168.10.222 255.255.255.0 192.168.10.254</w:t>
       </w:r>
@@ -11999,7 +12022,6 @@
         <w:ind w:left="709" w:hanging="709"/>
         <w:rPr>
           <w:rFonts w:eastAsia="Courier New"/>
-          <w:lang w:val="en-US"/>
         </w:rPr>
       </w:pPr>
     </w:p>
@@ -12130,7 +12152,7 @@
                     <pic:cNvPicPr/>
                   </pic:nvPicPr>
                   <pic:blipFill>
-                    <a:blip r:embed="rId26"/>
+                    <a:blip r:embed="rId29"/>
                     <a:stretch>
                       <a:fillRect/>
                     </a:stretch>
@@ -12342,7 +12364,15 @@
       </w:r>
       <w:proofErr w:type="spellEnd"/>
       <w:r>
-        <w:t>-the-Middle)</w:t>
+        <w:t>-</w:t>
+      </w:r>
+      <w:proofErr w:type="spellStart"/>
+      <w:r>
+        <w:t>the</w:t>
+      </w:r>
+      <w:proofErr w:type="spellEnd"/>
+      <w:r>
+        <w:t>-Middle)</w:t>
       </w:r>
       <w:r>
         <w:t>;</w:t>
@@ -12405,49 +12435,221 @@
         <w:rPr>
           <w:lang w:val="ru-RU"/>
         </w:rPr>
-        <w:t xml:space="preserve">Алиев </w:t>
+        <w:t xml:space="preserve">Алиев Т.И., Соснин В.В., </w:t>
+      </w:r>
+      <w:proofErr w:type="spellStart"/>
+      <w:r>
+        <w:rPr>
+          <w:lang w:val="ru-RU"/>
+        </w:rPr>
+        <w:t>Шинкарук</w:t>
+      </w:r>
+      <w:proofErr w:type="spellEnd"/>
+      <w:r>
+        <w:rPr>
+          <w:lang w:val="ru-RU"/>
+        </w:rPr>
+        <w:t xml:space="preserve"> Д.Н. Компьютерные сети и телекоммуникации: задания и тесты. – СПб: Университет ИТМО – 2018. – 112 c.</w:t>
+      </w:r>
+    </w:p>
+    <w:p>
+      <w:pPr>
+        <w:pStyle w:val="a"/>
+        <w:rPr>
+          <w:lang w:val="ru-RU"/>
+        </w:rPr>
+      </w:pPr>
+      <w:proofErr w:type="spellStart"/>
+      <w:r>
+        <w:rPr>
+          <w:lang w:val="ru-RU"/>
+        </w:rPr>
+        <w:t>Куроуз</w:t>
+      </w:r>
+      <w:proofErr w:type="spellEnd"/>
+      <w:r>
+        <w:rPr>
+          <w:lang w:val="ru-RU"/>
+        </w:rPr>
+        <w:t xml:space="preserve"> Дж. Ф., Росс К. В. Компьютерные сети: Нисходящий подход / пер. с англ. – 6-е изд. – М.: Эксмо, 2016. – 912 с.</w:t>
+      </w:r>
+    </w:p>
+    <w:p>
+      <w:pPr>
+        <w:pStyle w:val="a"/>
+        <w:rPr>
+          <w:lang w:val="ru-RU"/>
+        </w:rPr>
+      </w:pPr>
+      <w:proofErr w:type="spellStart"/>
+      <w:r>
+        <w:rPr>
+          <w:lang w:val="ru-RU"/>
+        </w:rPr>
+        <w:t>LinuxShop</w:t>
+      </w:r>
+      <w:proofErr w:type="spellEnd"/>
+      <w:r>
+        <w:rPr>
+          <w:lang w:val="ru-RU"/>
+        </w:rPr>
+        <w:t xml:space="preserve">. Cisco: Базовые команды и </w:t>
       </w:r>
       <w:proofErr w:type="gramStart"/>
       <w:r>
         <w:rPr>
           <w:lang w:val="ru-RU"/>
         </w:rPr>
-        <w:t>Т.И.</w:t>
+        <w:t>настройки :</w:t>
       </w:r>
       <w:proofErr w:type="gramEnd"/>
       <w:r>
         <w:rPr>
           <w:lang w:val="ru-RU"/>
         </w:rPr>
-        <w:t xml:space="preserve">, Соснин </w:t>
+        <w:t xml:space="preserve"> сайт. – </w:t>
       </w:r>
       <w:proofErr w:type="gramStart"/>
       <w:r>
         <w:rPr>
           <w:lang w:val="ru-RU"/>
         </w:rPr>
-        <w:t>В.В.</w:t>
+        <w:t>Текст :</w:t>
       </w:r>
       <w:proofErr w:type="gramEnd"/>
       <w:r>
         <w:rPr>
           <w:lang w:val="ru-RU"/>
         </w:rPr>
-        <w:t xml:space="preserve">, </w:t>
-      </w:r>
+        <w:t xml:space="preserve"> электронный. – URL: https://www.linuxshop.ru/articles/a26710803-cisco_bazovye_komandy_i_nastroyki (дата обращения: </w:t>
+      </w:r>
+      <w:r>
+        <w:rPr>
+          <w:lang w:val="ru-RU"/>
+        </w:rPr>
+        <w:t>19</w:t>
+      </w:r>
+      <w:r>
+        <w:rPr>
+          <w:lang w:val="ru-RU"/>
+        </w:rPr>
+        <w:t>.02.2026).</w:t>
+      </w:r>
+    </w:p>
+    <w:p>
+      <w:pPr>
+        <w:pStyle w:val="a"/>
+        <w:rPr>
+          <w:lang w:val="ru-RU"/>
+        </w:rPr>
+      </w:pPr>
+      <w:r>
+        <w:rPr>
+          <w:lang w:val="ru-RU"/>
+        </w:rPr>
+        <w:t xml:space="preserve">XGU.ru. Безопасность канального </w:t>
+      </w:r>
+      <w:proofErr w:type="gramStart"/>
+      <w:r>
+        <w:rPr>
+          <w:lang w:val="ru-RU"/>
+        </w:rPr>
+        <w:t>уровня :</w:t>
+      </w:r>
+      <w:proofErr w:type="gramEnd"/>
+      <w:r>
+        <w:rPr>
+          <w:lang w:val="ru-RU"/>
+        </w:rPr>
+        <w:t xml:space="preserve"> база знаний. – </w:t>
+      </w:r>
+      <w:proofErr w:type="gramStart"/>
+      <w:r>
+        <w:rPr>
+          <w:lang w:val="ru-RU"/>
+        </w:rPr>
+        <w:t>Текст :</w:t>
+      </w:r>
+      <w:proofErr w:type="gramEnd"/>
+      <w:r>
+        <w:rPr>
+          <w:lang w:val="ru-RU"/>
+        </w:rPr>
+        <w:t xml:space="preserve"> электронный. – URL: http://xgu.ru/wiki/%D0%91%D0%B5%D0%B7%D0%BE%D0%BF%D0%B0%D1%81%D0%BD%D0%BE%D1%81%D1%82%D1%8C_%D0%BA%D0%B0%D0%BD%D0%B0%D0%BB%D1%8C%D0%BD%D0%BE%D0%B3%D0%BE_%D1%83%D1%80%D0%BE%D0%B2%D0%BD%D1%8F (дата обращения: </w:t>
+      </w:r>
+      <w:r>
+        <w:rPr>
+          <w:lang w:val="ru-RU"/>
+        </w:rPr>
+        <w:t>19</w:t>
+      </w:r>
+      <w:r>
+        <w:rPr>
+          <w:lang w:val="ru-RU"/>
+        </w:rPr>
+        <w:t>.02.2026).</w:t>
+      </w:r>
+    </w:p>
+    <w:p>
+      <w:pPr>
+        <w:pStyle w:val="a"/>
+        <w:rPr>
+          <w:lang w:val="ru-RU"/>
+        </w:rPr>
+      </w:pPr>
       <w:proofErr w:type="spellStart"/>
       <w:r>
         <w:rPr>
           <w:lang w:val="ru-RU"/>
         </w:rPr>
-        <w:t>Шинкарук</w:t>
+        <w:t>Linkmeup</w:t>
       </w:r>
       <w:proofErr w:type="spellEnd"/>
       <w:r>
         <w:rPr>
           <w:lang w:val="ru-RU"/>
         </w:rPr>
-        <w:t xml:space="preserve"> Д.Н. Компьютерные сети и телекоммуникации: задания и тесты. – СПб: Университет ИТМО – 2018. – 112 c.</w:t>
+        <w:t xml:space="preserve">. Сети для самых маленьких. Часть 4. STP. Port </w:t>
+      </w:r>
+      <w:proofErr w:type="gramStart"/>
+      <w:r>
+        <w:rPr>
+          <w:lang w:val="ru-RU"/>
+        </w:rPr>
+        <w:t>Security :</w:t>
+      </w:r>
+      <w:proofErr w:type="gramEnd"/>
+      <w:r>
+        <w:rPr>
+          <w:lang w:val="ru-RU"/>
+        </w:rPr>
+        <w:t xml:space="preserve"> онлайн-учебник. – </w:t>
+      </w:r>
+      <w:proofErr w:type="gramStart"/>
+      <w:r>
+        <w:rPr>
+          <w:lang w:val="ru-RU"/>
+        </w:rPr>
+        <w:t>Текст :</w:t>
+      </w:r>
+      <w:proofErr w:type="gramEnd"/>
+      <w:r>
+        <w:rPr>
+          <w:lang w:val="ru-RU"/>
+        </w:rPr>
+        <w:t xml:space="preserve"> электронный. – URL: https://linkmeup.gitbook.io/sdsm/4.-stp/06-port-security (дата обращения: </w:t>
+      </w:r>
+      <w:r>
+        <w:rPr>
+          <w:lang w:val="ru-RU"/>
+        </w:rPr>
+        <w:t>19</w:t>
+      </w:r>
+      <w:r>
+        <w:rPr>
+          <w:lang w:val="ru-RU"/>
+        </w:rPr>
+        <w:t>.02.2026).</w:t>
       </w:r>
     </w:p>
     <w:p>
@@ -12462,258 +12664,58 @@
         <w:rPr>
           <w:lang w:val="ru-RU"/>
         </w:rPr>
-        <w:t>Куроуз</w:t>
+        <w:t>Merion</w:t>
       </w:r>
       <w:proofErr w:type="spellEnd"/>
       <w:r>
         <w:rPr>
           <w:lang w:val="ru-RU"/>
         </w:rPr>
-        <w:t xml:space="preserve"> Дж. Ф., Росс К. В. Компьютерные сети: Нисходящий подход / пер. с англ. – 6-е изд. – М.: Эксмо, 2016. – 912 с.</w:t>
-      </w:r>
-    </w:p>
-    <w:p>
-      <w:pPr>
-        <w:pStyle w:val="a"/>
+        <w:t xml:space="preserve"> Networks. Полное руководство по настройке </w:t>
+      </w:r>
+      <w:proofErr w:type="gramStart"/>
+      <w:r>
         <w:rPr>
           <w:lang w:val="ru-RU"/>
         </w:rPr>
-      </w:pPr>
-      <w:proofErr w:type="spellStart"/>
+        <w:t>VLAN :</w:t>
+      </w:r>
+      <w:proofErr w:type="gramEnd"/>
       <w:r>
         <w:rPr>
           <w:lang w:val="ru-RU"/>
         </w:rPr>
-        <w:t>LinuxShop</w:t>
-      </w:r>
-      <w:proofErr w:type="spellEnd"/>
+        <w:t xml:space="preserve"> база знаний. – </w:t>
+      </w:r>
+      <w:proofErr w:type="gramStart"/>
       <w:r>
         <w:rPr>
           <w:lang w:val="ru-RU"/>
         </w:rPr>
-        <w:t xml:space="preserve">. Cisco: Базовые команды и </w:t>
-      </w:r>
-      <w:proofErr w:type="gramStart"/>
+        <w:t>Текст :</w:t>
+      </w:r>
+      <w:proofErr w:type="gramEnd"/>
       <w:r>
         <w:rPr>
           <w:lang w:val="ru-RU"/>
         </w:rPr>
-        <w:t>настройки :</w:t>
-      </w:r>
-      <w:proofErr w:type="gramEnd"/>
+        <w:t xml:space="preserve"> электронный. – URL: https://wiki.merionet.ru/articles/polnoe-rukovodstvo-po-nastrojke-vlan (дата обращения: </w:t>
+      </w:r>
       <w:r>
         <w:rPr>
           <w:lang w:val="ru-RU"/>
         </w:rPr>
-        <w:t xml:space="preserve"> сайт. – </w:t>
-      </w:r>
-      <w:proofErr w:type="gramStart"/>
+        <w:t>19</w:t>
+      </w:r>
       <w:r>
         <w:rPr>
           <w:lang w:val="ru-RU"/>
         </w:rPr>
-        <w:t>Текст :</w:t>
-      </w:r>
-      <w:proofErr w:type="gramEnd"/>
-      <w:r>
-        <w:rPr>
-          <w:lang w:val="ru-RU"/>
-        </w:rPr>
-        <w:t xml:space="preserve"> электронный. – URL: https://www.linuxshop.ru/articles/a26710803-cisco_bazovye_komandy_i_nastroyki (дата обращения: </w:t>
-      </w:r>
-      <w:r>
-        <w:rPr>
-          <w:lang w:val="ru-RU"/>
-        </w:rPr>
-        <w:t>19</w:t>
-      </w:r>
-      <w:r>
-        <w:rPr>
-          <w:lang w:val="ru-RU"/>
-        </w:rPr>
         <w:t>.02.2026).</w:t>
       </w:r>
     </w:p>
-    <w:p>
-      <w:pPr>
-        <w:pStyle w:val="a"/>
-        <w:rPr>
-          <w:lang w:val="ru-RU"/>
-        </w:rPr>
-      </w:pPr>
-      <w:r>
-        <w:rPr>
-          <w:lang w:val="ru-RU"/>
-        </w:rPr>
-        <w:t xml:space="preserve">XGU.ru. Безопасность канального </w:t>
-      </w:r>
-      <w:proofErr w:type="gramStart"/>
-      <w:r>
-        <w:rPr>
-          <w:lang w:val="ru-RU"/>
-        </w:rPr>
-        <w:t>уровня :</w:t>
-      </w:r>
-      <w:proofErr w:type="gramEnd"/>
-      <w:r>
-        <w:rPr>
-          <w:lang w:val="ru-RU"/>
-        </w:rPr>
-        <w:t xml:space="preserve"> база знаний. – </w:t>
-      </w:r>
-      <w:proofErr w:type="gramStart"/>
-      <w:r>
-        <w:rPr>
-          <w:lang w:val="ru-RU"/>
-        </w:rPr>
-        <w:t>Текст :</w:t>
-      </w:r>
-      <w:proofErr w:type="gramEnd"/>
-      <w:r>
-        <w:rPr>
-          <w:lang w:val="ru-RU"/>
-        </w:rPr>
-        <w:t xml:space="preserve"> электронный. – URL: http://xgu.ru/wiki/%D0%91%D0%B5%D0%B7%D0%BE%D0%BF%D0%B0%D1%81%D0%BD%D0%BE%D1%81%D1%82%D1%8C_%D0%BA%D0%B0%D0%BD%D0%B0%D0%BB%D1%8C%D0%BD%D0%BE%D0%B3%D0%BE_%D1%83%D1%80%D0%BE%D0%B2%D0%BD%D1%8F (дата обращения: </w:t>
-      </w:r>
-      <w:r>
-        <w:rPr>
-          <w:lang w:val="ru-RU"/>
-        </w:rPr>
-        <w:t>19</w:t>
-      </w:r>
-      <w:r>
-        <w:rPr>
-          <w:lang w:val="ru-RU"/>
-        </w:rPr>
-        <w:t>.02.2026).</w:t>
-      </w:r>
-    </w:p>
-    <w:p>
-      <w:pPr>
-        <w:pStyle w:val="a"/>
-        <w:rPr>
-          <w:lang w:val="ru-RU"/>
-        </w:rPr>
-      </w:pPr>
-      <w:proofErr w:type="spellStart"/>
-      <w:r>
-        <w:rPr>
-          <w:lang w:val="ru-RU"/>
-        </w:rPr>
-        <w:t>Linkmeup</w:t>
-      </w:r>
-      <w:proofErr w:type="spellEnd"/>
-      <w:r>
-        <w:rPr>
-          <w:lang w:val="ru-RU"/>
-        </w:rPr>
-        <w:t xml:space="preserve">. Сети для самых маленьких. Часть 4. STP. Port </w:t>
-      </w:r>
-      <w:proofErr w:type="gramStart"/>
-      <w:r>
-        <w:rPr>
-          <w:lang w:val="ru-RU"/>
-        </w:rPr>
-        <w:t>Security :</w:t>
-      </w:r>
-      <w:proofErr w:type="gramEnd"/>
-      <w:r>
-        <w:rPr>
-          <w:lang w:val="ru-RU"/>
-        </w:rPr>
-        <w:t xml:space="preserve"> онлайн-учебник. – </w:t>
-      </w:r>
-      <w:proofErr w:type="gramStart"/>
-      <w:r>
-        <w:rPr>
-          <w:lang w:val="ru-RU"/>
-        </w:rPr>
-        <w:t>Текст :</w:t>
-      </w:r>
-      <w:proofErr w:type="gramEnd"/>
-      <w:r>
-        <w:rPr>
-          <w:lang w:val="ru-RU"/>
-        </w:rPr>
-        <w:t xml:space="preserve"> электронный. – URL: https://linkmeup.gitbook.io/sdsm/4.-stp/06-port-security (дата обращения: </w:t>
-      </w:r>
-      <w:r>
-        <w:rPr>
-          <w:lang w:val="ru-RU"/>
-        </w:rPr>
-        <w:t>19</w:t>
-      </w:r>
-      <w:r>
-        <w:rPr>
-          <w:lang w:val="ru-RU"/>
-        </w:rPr>
-        <w:t>.02.2026).</w:t>
-      </w:r>
-    </w:p>
-    <w:p>
-      <w:pPr>
-        <w:pStyle w:val="a"/>
-        <w:rPr>
-          <w:lang w:val="ru-RU"/>
-        </w:rPr>
-      </w:pPr>
-      <w:proofErr w:type="spellStart"/>
-      <w:r>
-        <w:rPr>
-          <w:lang w:val="ru-RU"/>
-        </w:rPr>
-        <w:t>Merion</w:t>
-      </w:r>
-      <w:proofErr w:type="spellEnd"/>
-      <w:r>
-        <w:rPr>
-          <w:lang w:val="ru-RU"/>
-        </w:rPr>
-        <w:t xml:space="preserve"> Networks. Полное руководство по настройке </w:t>
-      </w:r>
-      <w:proofErr w:type="gramStart"/>
-      <w:r>
-        <w:rPr>
-          <w:lang w:val="ru-RU"/>
-        </w:rPr>
-        <w:t>VLAN :</w:t>
-      </w:r>
-      <w:proofErr w:type="gramEnd"/>
-      <w:r>
-        <w:rPr>
-          <w:lang w:val="ru-RU"/>
-        </w:rPr>
-        <w:t xml:space="preserve"> база знаний. – </w:t>
-      </w:r>
-      <w:proofErr w:type="gramStart"/>
-      <w:r>
-        <w:rPr>
-          <w:lang w:val="ru-RU"/>
-        </w:rPr>
-        <w:t>Текст :</w:t>
-      </w:r>
-      <w:proofErr w:type="gramEnd"/>
-      <w:r>
-        <w:rPr>
-          <w:lang w:val="ru-RU"/>
-        </w:rPr>
-        <w:t xml:space="preserve"> электронный. – URL: https://wiki.merionet.ru/articles/polnoe-rukovodstvo-po-nastrojke-vlan (дата обращения: </w:t>
-      </w:r>
-      <w:r>
-        <w:rPr>
-          <w:lang w:val="ru-RU"/>
-        </w:rPr>
-        <w:t>19</w:t>
-      </w:r>
-      <w:r>
-        <w:rPr>
-          <w:lang w:val="ru-RU"/>
-        </w:rPr>
-        <w:t>.02.2026).</w:t>
-      </w:r>
-    </w:p>
     <w:sectPr>
-      <w:footerReference w:type="default" r:id="rId27"/>
+      <w:footerReference w:type="default" r:id="rId30"/>
       <w:pgSz w:w="11906" w:h="16838"/>
       <w:pgMar w:top="1134" w:right="850" w:bottom="1134" w:left="1701" w:header="708" w:footer="422" w:gutter="0"/>
       <w:pgNumType w:start="2"/>
@@ -16050,15 +16052,6 @@
   </w:num>
   <w:num w:numId="39" w16cid:durableId="643657319">
     <w:abstractNumId w:val="27"/>
-    <w:lvlOverride w:ilvl="0"/>
-    <w:lvlOverride w:ilvl="1"/>
-    <w:lvlOverride w:ilvl="2"/>
-    <w:lvlOverride w:ilvl="3"/>
-    <w:lvlOverride w:ilvl="4"/>
-    <w:lvlOverride w:ilvl="5"/>
-    <w:lvlOverride w:ilvl="6"/>
-    <w:lvlOverride w:ilvl="7"/>
-    <w:lvlOverride w:ilvl="8"/>
   </w:num>
   <w:num w:numId="40" w16cid:durableId="183323476">
     <w:abstractNumId w:val="12"/>
@@ -16639,6 +16632,7 @@
   <w:style w:type="character" w:default="1" w:styleId="a8">
     <w:name w:val="Default Paragraph Font"/>
     <w:uiPriority w:val="1"/>
+    <w:semiHidden/>
     <w:unhideWhenUsed/>
   </w:style>
   <w:style w:type="table" w:default="1" w:styleId="a9">

</xml_diff>